<commit_message>
feat: complete phase 3C
</commit_message>
<xml_diff>
--- a/docs/original-game-design.docx
+++ b/docs/original-game-design.docx
@@ -909,8 +909,6 @@
         </w:rPr>
         <w:t>日系男</w:t>
       </w:r>
-      <w:bookmarkStart w:id="0" w:name="_GoBack"/>
-      <w:bookmarkEnd w:id="0"/>
     </w:p>
     <w:p>
       <w:pPr>
@@ -4751,71 +4749,624 @@
       </w:r>
     </w:p>
     <w:p>
-      <w:r>
-        <w:t>进入第 12 周、第 24 周、第 36 周或好感度达到 91 以上后，可逐步触发结局分歧。</w:t>
-      </w:r>
-    </w:p>
-    <w:p>
-      <w:r>
-        <w:t>HE：隐秘而稳定的爱</w:t>
-      </w:r>
-    </w:p>
-    <w:p>
-      <w:r>
-        <w:t>条件示例：好感度 ≥ 90；恋情保密度 ≥ 60；公司警觉度 ≤ 70；玩家有稳定自我生活；男主事业压力未崩盘。结局方向：你们没有公开，但拥有真实、稳定、彼此尊重的关系。你仍然有自己的生活，他也仍然属于舞台。只是在人群散去后，你们终于不用怀疑彼此的真心。</w:t>
-      </w:r>
-    </w:p>
-    <w:p>
-      <w:r>
-        <w:t>OE：未公开的等待</w:t>
-      </w:r>
-    </w:p>
-    <w:p>
-      <w:r>
-        <w:t>条件示例：好感度高；事业压力高；公司警觉度高；双方仍相爱，但现实不允许靠近。结局方向：他去巡演，你继续生活。你们没有说分手，也没有承诺未来。聊天框停在一句“落地了吗”，像一场没有结束的雨。</w:t>
-      </w:r>
-    </w:p>
-    <w:p>
-      <w:r>
-        <w:t>BE：曝光后的分离</w:t>
-      </w:r>
-    </w:p>
-    <w:p>
-      <w:r>
-        <w:t>条件示例：恋情保密度 &lt; 20；公司警觉度 &gt; 85；人气值过高且舆论失控。结局方向：公司发声明否认关系，男主沉默，你成为粉圈攻击中心。你们不是不爱了，而是没有能力保护彼此。</w:t>
-      </w:r>
-    </w:p>
-    <w:p>
-      <w:r>
-        <w:t>BE：你选择离开</w:t>
-      </w:r>
-    </w:p>
-    <w:p>
-      <w:r>
-        <w:t>条件示例：心情值长期过低；玩家多次选择自我保护；男主无法给予稳定回应。结局方向：你删掉聊天记录，搬离首尔，重新开始生活。后来你再听到他的歌，还是会在某一句歌词里停顿一下。</w:t>
-      </w:r>
-    </w:p>
-    <w:p>
-      <w:r>
-        <w:t>SE：公开恋爱</w:t>
-      </w:r>
-    </w:p>
-    <w:p>
-      <w:r>
-        <w:t>条件示例：好感度 ≥ 95；男主事业基础稳定；玩家人气值或自我事业足够支撑舆论；公司警觉度可控；触发高难度公开事件并成功。结局方向：公司承认“两人正在互相了解中”。舆论并不温柔，</w:t>
-      </w:r>
-      <w:r>
-        <w:rPr>
-          <w:rFonts w:hint="eastAsia" w:eastAsia="宋体"/>
-          <w:lang w:eastAsia="zh-CN"/>
-        </w:rPr>
-        <w:t>花园丝</w:t>
-      </w:r>
-      <w:r>
-        <w:t>也并非全员祝福。但你们第一次不用在人群里装作陌生人。</w:t>
-      </w:r>
-    </w:p>
-    <w:p/>
+      <w:pPr>
+        <w:rPr/>
+      </w:pPr>
+      <w:r>
+        <w:t>17.1 结局触发总规则</w:t>
+      </w:r>
+    </w:p>
+    <w:p>
+      <w:pPr>
+        <w:rPr/>
+      </w:pPr>
+      <w:r>
+        <w:t>游戏保留 HE、OE、BE、SE 四类结局，共五种具体结局。</w:t>
+      </w:r>
+    </w:p>
+    <w:p>
+      <w:pPr>
+        <w:rPr/>
+      </w:pPr>
+      <w:r>
+        <w:t>结局进度门槛：第 12、24、36 周为结局检查节点。</w:t>
+      </w:r>
+    </w:p>
+    <w:p>
+      <w:pPr>
+        <w:rPr/>
+      </w:pPr>
+      <w:r>
+        <w:t>好感度达到 91 以上时，可提前解锁结局分歧事件，但不代表立即结束游戏。</w:t>
+      </w:r>
+    </w:p>
+    <w:p>
+      <w:pPr>
+        <w:rPr/>
+      </w:pPr>
+      <w:r>
+        <w:t>满足结局条件后，Ending Engine 只生成结局候选，不直接强制结局。</w:t>
+      </w:r>
+    </w:p>
+    <w:p>
+      <w:pPr>
+        <w:rPr/>
+      </w:pPr>
+      <w:r>
+        <w:t>玩家通过关键剧情事件或最终选择确认后，才正式进入结局。</w:t>
+      </w:r>
+    </w:p>
+    <w:p>
+      <w:pPr>
+        <w:rPr/>
+      </w:pPr>
+      <w:r>
+        <w:t>若同时满足多个结局条件，由当前关键事件、玩家选择和结局优先级决定，不随机选择。</w:t>
+      </w:r>
+    </w:p>
+    <w:p>
+      <w:pPr>
+        <w:rPr/>
+      </w:pPr>
+      <w:r>
+        <w:t>以下新增阈值为游戏产品化后的第一版设计规则。</w:t>
+      </w:r>
+    </w:p>
+    <w:p>
+      <w:pPr>
+        <w:rPr/>
+      </w:pPr>
+      <w:r>
+        <w:t>17.2 HE：隐秘而稳定的爱</w:t>
+      </w:r>
+    </w:p>
+    <w:p>
+      <w:r>
+        <w:t>数值条件：</w:t>
+      </w:r>
+    </w:p>
+    <w:p>
+      <w:pPr>
+        <w:rPr/>
+      </w:pPr>
+      <w:r>
+        <w:t>好感度 ≥ 90恋情保密度 ≥ 60公司警觉度 ≤ 70事业压力 ≤ 90玩家心情值 ≥ 40玩家金钱 ≥ 500</w:t>
+      </w:r>
+    </w:p>
+    <w:p>
+      <w:pPr>
+        <w:rPr/>
+      </w:pPr>
+      <w:r>
+        <w:t>剧情条件：</w:t>
+      </w:r>
+    </w:p>
+    <w:p>
+      <w:pPr>
+        <w:rPr/>
+      </w:pPr>
+      <w:r>
+        <w:t>玩家在最近 8 周内至少完成 2 次学业、工作或个人成长相关事件。</w:t>
+      </w:r>
+    </w:p>
+    <w:p>
+      <w:pPr>
+        <w:rPr/>
+      </w:pPr>
+      <w:r>
+        <w:t>双方已通过至少一次重要关系确认事件。</w:t>
+      </w:r>
+    </w:p>
+    <w:p>
+      <w:pPr>
+        <w:rPr/>
+      </w:pPr>
+      <w:r>
+        <w:t>未发生尚未解决的严重分手或公开危机。</w:t>
+      </w:r>
+    </w:p>
+    <w:p>
+      <w:pPr>
+        <w:rPr/>
+      </w:pPr>
+      <w:r>
+        <w:t>结局方向：</w:t>
+      </w:r>
+    </w:p>
+    <w:p>
+      <w:pPr>
+        <w:rPr/>
+      </w:pPr>
+      <w:r>
+        <w:t>你们没有公开，但拥有真实、稳定、彼此尊重的关系。你仍然有自己的生活，他也仍然属于舞台。只是在人群散去后，你们终于不用怀疑彼此的真心。</w:t>
+      </w:r>
+    </w:p>
+    <w:p>
+      <w:pPr>
+        <w:rPr/>
+      </w:pPr>
+      <w:r>
+        <w:t>17.3 OE：未公开的等待</w:t>
+      </w:r>
+    </w:p>
+    <w:p>
+      <w:r>
+        <w:t>数值条件：好感度 ≥ 81事业压力 ≥ 75公司警觉度 ≥ 70</w:t>
+      </w:r>
+    </w:p>
+    <w:p>
+      <w:pPr>
+        <w:rPr/>
+      </w:pPr>
+      <w:r>
+        <w:t>剧情条件：</w:t>
+      </w:r>
+    </w:p>
+    <w:p>
+      <w:pPr>
+        <w:rPr/>
+      </w:pPr>
+      <w:r>
+        <w:t>双方曾确认关系，且当前未正式分手。</w:t>
+      </w:r>
+    </w:p>
+    <w:p>
+      <w:pPr>
+        <w:rPr/>
+      </w:pPr>
+      <w:r>
+        <w:t>已发生巡演异地、公司限制接触或长期分离事件之一。</w:t>
+      </w:r>
+    </w:p>
+    <w:p>
+      <w:pPr>
+        <w:rPr/>
+      </w:pPr>
+      <w:r>
+        <w:t>双方在关键事件中选择继续等待或暂时维持关系。</w:t>
+      </w:r>
+    </w:p>
+    <w:p>
+      <w:pPr>
+        <w:rPr/>
+      </w:pPr>
+      <w:r>
+        <w:t>结局方向：</w:t>
+      </w:r>
+    </w:p>
+    <w:p>
+      <w:pPr>
+        <w:rPr/>
+      </w:pPr>
+      <w:r>
+        <w:t>他去巡演，你继续生活。你们没有说分手，也没有承诺未来。聊天框停在一句“落地了吗”，像一场没有结束的雨。</w:t>
+      </w:r>
+    </w:p>
+    <w:p>
+      <w:pPr>
+        <w:rPr/>
+      </w:pPr>
+      <w:r>
+        <w:t>17.4 BE：曝光后的分离</w:t>
+      </w:r>
+    </w:p>
+    <w:p>
+      <w:pPr>
+        <w:rPr/>
+      </w:pPr>
+      <w:r>
+        <w:t>数值条件：</w:t>
+      </w:r>
+    </w:p>
+    <w:p>
+      <w:pPr>
+        <w:rPr/>
+      </w:pPr>
+      <w:r>
+        <w:t>恋情保密度 &lt; 20公司警觉度 &gt; 85玩家人气值 &gt; 60</w:t>
+      </w:r>
+    </w:p>
+    <w:p>
+      <w:r>
+        <w:t>剧情条件：</w:t>
+      </w:r>
+    </w:p>
+    <w:p>
+      <w:pPr>
+        <w:rPr/>
+      </w:pPr>
+      <w:r>
+        <w:t>已触发重大恋情曝光事件。</w:t>
+      </w:r>
+    </w:p>
+    <w:p>
+      <w:pPr>
+        <w:rPr/>
+      </w:pPr>
+      <w:r>
+        <w:t>舆论危机进入失控状态。</w:t>
+      </w:r>
+    </w:p>
+    <w:p>
+      <w:pPr>
+        <w:rPr/>
+      </w:pPr>
+      <w:r>
+        <w:t>曝光事件中未能成功保护双方关系，最终选择分离或被迫分离。</w:t>
+      </w:r>
+    </w:p>
+    <w:p>
+      <w:pPr>
+        <w:rPr/>
+      </w:pPr>
+      <w:r>
+        <w:t>结局方向：</w:t>
+      </w:r>
+    </w:p>
+    <w:p>
+      <w:pPr>
+        <w:rPr/>
+      </w:pPr>
+      <w:r>
+        <w:t>公司发声明否认关系，男主沉默，你成为粉圈攻击中心。你们不是不爱了，而是没有能力保护彼此。</w:t>
+      </w:r>
+    </w:p>
+    <w:p>
+      <w:pPr>
+        <w:rPr/>
+      </w:pPr>
+      <w:r>
+        <w:t>17.5 BE：你选择离开</w:t>
+      </w:r>
+    </w:p>
+    <w:p>
+      <w:pPr>
+        <w:rPr/>
+      </w:pPr>
+      <w:r>
+        <w:t>历史数值条件：</w:t>
+      </w:r>
+    </w:p>
+    <w:p>
+      <w:pPr>
+        <w:rPr/>
+      </w:pPr>
+      <w:r>
+        <w:t>最近 5 周内至少 3 周的结算心情值 &lt; 30。</w:t>
+      </w:r>
+    </w:p>
+    <w:p>
+      <w:pPr>
+        <w:rPr/>
+      </w:pPr>
+      <w:r>
+        <w:t>玩家累计至少 3 次在重要感情冲突中选择自我保护、主动退出或保持距离。</w:t>
+      </w:r>
+    </w:p>
+    <w:p>
+      <w:pPr>
+        <w:rPr/>
+      </w:pPr>
+      <w:r>
+        <w:t>剧情条件：</w:t>
+      </w:r>
+    </w:p>
+    <w:p>
+      <w:pPr>
+        <w:rPr/>
+      </w:pPr>
+      <w:r>
+        <w:t>男主在至少 2 次重要关系冲突中未能给予稳定回应。</w:t>
+      </w:r>
+    </w:p>
+    <w:p>
+      <w:pPr>
+        <w:rPr/>
+      </w:pPr>
+      <w:r>
+        <w:t>玩家在最终关系抉择中明确选择离开。</w:t>
+      </w:r>
+    </w:p>
+    <w:p>
+      <w:pPr>
+        <w:rPr/>
+      </w:pPr>
+    </w:p>
+    <w:p>
+      <w:pPr>
+        <w:rPr/>
+      </w:pPr>
+      <w:r>
+        <w:t>结局方向：</w:t>
+      </w:r>
+    </w:p>
+    <w:p>
+      <w:pPr>
+        <w:rPr/>
+      </w:pPr>
+      <w:r>
+        <w:t>你删掉聊天记录，搬离首尔，重新开始生活。后来你再听到他的歌，还是会在某一句歌词里停顿一下。</w:t>
+      </w:r>
+    </w:p>
+    <w:p>
+      <w:pPr>
+        <w:rPr/>
+      </w:pPr>
+      <w:r>
+        <w:t>17.6 SE：公开恋爱</w:t>
+      </w:r>
+    </w:p>
+    <w:p>
+      <w:pPr>
+        <w:rPr/>
+      </w:pPr>
+      <w:r>
+        <w:t>数值条件：</w:t>
+      </w:r>
+    </w:p>
+    <w:p>
+      <w:pPr>
+        <w:rPr/>
+      </w:pPr>
+      <w:r>
+        <w:t>好感度 ≥ 95事业压力 ≤ 60公司警觉度 ≤ 60玩家人气值 ≥ 60，或已完成个人事业稳定事件线。</w:t>
+      </w:r>
+    </w:p>
+    <w:p>
+      <w:pPr>
+        <w:rPr/>
+      </w:pPr>
+      <w:r>
+        <w:t>剧情条件：</w:t>
+      </w:r>
+    </w:p>
+    <w:p>
+      <w:pPr>
+        <w:rPr/>
+      </w:pPr>
+      <w:r>
+        <w:t>双方已确认关系。</w:t>
+      </w:r>
+    </w:p>
+    <w:p>
+      <w:pPr>
+        <w:rPr/>
+      </w:pPr>
+      <w:r>
+        <w:t>男主完成重要事业稳定或阶段性事业突破事件。</w:t>
+      </w:r>
+    </w:p>
+    <w:p>
+      <w:pPr>
+        <w:rPr/>
+      </w:pPr>
+      <w:r>
+        <w:t>已触发高难度公开恋爱事件。</w:t>
+      </w:r>
+    </w:p>
+    <w:p>
+      <w:pPr>
+        <w:rPr/>
+      </w:pPr>
+      <w:r>
+        <w:t>玩家在公开事件中成功处理公司与舆论压力。</w:t>
+      </w:r>
+    </w:p>
+    <w:p>
+      <w:pPr>
+        <w:rPr/>
+      </w:pPr>
+      <w:r>
+        <w:t>结局方向：</w:t>
+      </w:r>
+    </w:p>
+    <w:p>
+      <w:pPr>
+        <w:rPr/>
+      </w:pPr>
+      <w:r>
+        <w:t>公司承认“两人正在互相了解中”。舆论并不温柔，花园丝也并非全员祝福。但你们第一次不用在人群里装作陌生人。</w:t>
+      </w:r>
+    </w:p>
+    <w:p>
+      <w:pPr>
+        <w:rPr/>
+      </w:pPr>
+      <w:r>
+        <w:t>17.7 剧情条件的自动记录规则</w:t>
+      </w:r>
+    </w:p>
+    <w:p>
+      <w:pPr>
+        <w:rPr/>
+      </w:pPr>
+      <w:r>
+        <w:t>所有剧情条件必须由游戏程序自动判断，不依赖玩家手动勾选。</w:t>
+      </w:r>
+    </w:p>
+    <w:p>
+      <w:pPr>
+        <w:rPr/>
+      </w:pPr>
+      <w:r>
+        <w:t>历史统计（History）：</w:t>
+      </w:r>
+    </w:p>
+    <w:p>
+      <w:pPr>
+        <w:rPr/>
+      </w:pPr>
+      <w:r>
+        <w:t>每周结算后记录七项属性快照。</w:t>
+      </w:r>
+    </w:p>
+    <w:p>
+      <w:pPr>
+        <w:rPr/>
+      </w:pPr>
+      <w:r>
+        <w:t>玩家选择带有结构化行为标签。</w:t>
+      </w:r>
+    </w:p>
+    <w:p>
+      <w:pPr>
+        <w:rPr/>
+      </w:pPr>
+      <w:r>
+        <w:t>系统统计自我保护次数、成长事件完成次数、关系冲突回应次数等。</w:t>
+      </w:r>
+    </w:p>
+    <w:p>
+      <w:pPr>
+        <w:rPr/>
+      </w:pPr>
+      <w:r>
+        <w:t>相同事件不得因重复渲染而重复计数。</w:t>
+      </w:r>
+    </w:p>
+    <w:p>
+      <w:pPr>
+        <w:rPr/>
+      </w:pPr>
+      <w:r>
+        <w:t>剧情事实（Story Flags）：</w:t>
+      </w:r>
+    </w:p>
+    <w:p>
+      <w:pPr>
+        <w:rPr/>
+      </w:pPr>
+      <w:r>
+        <w:t>关系是否已确认</w:t>
+      </w:r>
+    </w:p>
+    <w:p>
+      <w:pPr>
+        <w:rPr/>
+      </w:pPr>
+      <w:r>
+        <w:t>是否正式分手</w:t>
+      </w:r>
+    </w:p>
+    <w:p>
+      <w:pPr>
+        <w:rPr/>
+      </w:pPr>
+      <w:r>
+        <w:t>是否发生重大曝光</w:t>
+      </w:r>
+    </w:p>
+    <w:p>
+      <w:pPr>
+        <w:rPr/>
+      </w:pPr>
+      <w:r>
+        <w:t>舆论危机是否失控</w:t>
+      </w:r>
+    </w:p>
+    <w:p>
+      <w:pPr>
+        <w:rPr/>
+      </w:pPr>
+      <w:r>
+        <w:t>是否进入长期异地</w:t>
+      </w:r>
+    </w:p>
+    <w:p>
+      <w:pPr>
+        <w:rPr/>
+      </w:pPr>
+      <w:r>
+        <w:t>是否完成事业稳定事件</w:t>
+      </w:r>
+    </w:p>
+    <w:p>
+      <w:pPr>
+        <w:rPr/>
+      </w:pPr>
+      <w:r>
+        <w:t>是否成功公开恋爱</w:t>
+      </w:r>
+    </w:p>
+    <w:p>
+      <w:pPr>
+        <w:rPr/>
+      </w:pPr>
+      <w:r>
+        <w:t>是否存在未解决的重大危机</w:t>
+      </w:r>
+    </w:p>
+    <w:p>
+      <w:pPr>
+        <w:rPr/>
+      </w:pPr>
+      <w:r>
+        <w:t>Story Flag 只能由对应的正式事件结算结果更新，不能由 AI 剧情文本直接修改。</w:t>
+      </w:r>
+    </w:p>
+    <w:p>
+      <w:pPr>
+        <w:rPr/>
+      </w:pPr>
+      <w:r>
+        <w:t>17.8 结局冲突与确认机制</w:t>
+      </w:r>
+    </w:p>
+    <w:p>
+      <w:pPr>
+        <w:rPr/>
+      </w:pPr>
+      <w:r>
+        <w:t>当多个结局同时满足条件时：</w:t>
+      </w:r>
+    </w:p>
+    <w:p>
+      <w:pPr>
+        <w:rPr/>
+      </w:pPr>
+      <w:r>
+        <w:t>先筛选所有满足条件的 Ending Candidates。</w:t>
+      </w:r>
+    </w:p>
+    <w:p>
+      <w:pPr>
+        <w:rPr/>
+      </w:pPr>
+      <w:r>
+        <w:t>根据当前关键剧情事件及玩家最终选择，判断对应结局方向。</w:t>
+      </w:r>
+    </w:p>
+    <w:p>
+      <w:pPr>
+        <w:rPr/>
+      </w:pPr>
+      <w:r>
+        <w:t>若尚未进行最终抉择，则继续剧情，不强制结束。</w:t>
+      </w:r>
+    </w:p>
+    <w:p>
+      <w:pPr>
+        <w:rPr/>
+      </w:pPr>
+      <w:r>
+        <w:t>正式结局一旦确认，存档记录 endingId 与结局时间。</w:t>
+      </w:r>
+    </w:p>
+    <w:p>
+      <w:pPr>
+        <w:rPr/>
+      </w:pPr>
+      <w:r>
+        <w:t>AI 只负责根据最终结局类型、人物设定、历史事件和 Memory 生成结局正文，不负责决定 endingId。</w:t>
+      </w:r>
+    </w:p>
+    <w:p>
+      <w:r>
+        <w:t>所有结局都必须尊重角色性格、关系发展和玩家既往选择，不得因单一属性达标而突然跳转到不符合剧情的结局。</w:t>
+      </w:r>
+      <w:bookmarkStart w:id="0" w:name="_GoBack"/>
+      <w:bookmarkEnd w:id="0"/>
+    </w:p>
     <w:p/>
     <w:p>
       <w:r>
@@ -5871,8 +6422,8 @@
     <w:lsdException w:uiPriority="99" w:name="Normal Indent"/>
     <w:lsdException w:uiPriority="99" w:name="footnote text"/>
     <w:lsdException w:uiPriority="99" w:name="annotation text"/>
-    <w:lsdException w:uiPriority="99" w:semiHidden="0" w:name="header"/>
-    <w:lsdException w:uiPriority="99" w:semiHidden="0" w:name="footer"/>
+    <w:lsdException w:qFormat="1" w:uiPriority="99" w:semiHidden="0" w:name="header"/>
+    <w:lsdException w:qFormat="1" w:uiPriority="99" w:semiHidden="0" w:name="footer"/>
     <w:lsdException w:uiPriority="99" w:name="index heading"/>
     <w:lsdException w:qFormat="1" w:uiPriority="35" w:name="caption"/>
     <w:lsdException w:uiPriority="99" w:name="table of figures"/>
@@ -5885,12 +6436,12 @@
     <w:lsdException w:uiPriority="99" w:name="endnote reference"/>
     <w:lsdException w:uiPriority="99" w:name="endnote text"/>
     <w:lsdException w:uiPriority="99" w:name="table of authorities"/>
-    <w:lsdException w:uiPriority="99" w:semiHidden="0" w:name="macro"/>
+    <w:lsdException w:qFormat="1" w:uiPriority="99" w:semiHidden="0" w:name="macro"/>
     <w:lsdException w:uiPriority="99" w:name="toa heading"/>
     <w:lsdException w:qFormat="1" w:uiPriority="99" w:semiHidden="0" w:name="List"/>
     <w:lsdException w:qFormat="1" w:uiPriority="99" w:semiHidden="0" w:name="List Bullet"/>
     <w:lsdException w:qFormat="1" w:uiPriority="99" w:semiHidden="0" w:name="List Number"/>
-    <w:lsdException w:uiPriority="99" w:semiHidden="0" w:name="List 2"/>
+    <w:lsdException w:qFormat="1" w:uiPriority="99" w:semiHidden="0" w:name="List 2"/>
     <w:lsdException w:qFormat="1" w:uiPriority="99" w:semiHidden="0" w:name="List 3"/>
     <w:lsdException w:uiPriority="99" w:name="List 4"/>
     <w:lsdException w:uiPriority="99" w:name="List 5"/>
@@ -5905,10 +6456,10 @@
     <w:lsdException w:qFormat="1" w:unhideWhenUsed="0" w:uiPriority="10" w:semiHidden="0" w:name="Title"/>
     <w:lsdException w:uiPriority="99" w:name="Closing"/>
     <w:lsdException w:uiPriority="99" w:name="Signature"/>
-    <w:lsdException w:uiPriority="1" w:name="Default Paragraph Font"/>
+    <w:lsdException w:qFormat="1" w:uiPriority="1" w:name="Default Paragraph Font"/>
     <w:lsdException w:qFormat="1" w:uiPriority="99" w:semiHidden="0" w:name="Body Text"/>
     <w:lsdException w:uiPriority="99" w:name="Body Text Indent"/>
-    <w:lsdException w:uiPriority="99" w:semiHidden="0" w:name="List Continue"/>
+    <w:lsdException w:qFormat="1" w:uiPriority="99" w:semiHidden="0" w:name="List Continue"/>
     <w:lsdException w:qFormat="1" w:uiPriority="99" w:semiHidden="0" w:name="List Continue 2"/>
     <w:lsdException w:qFormat="1" w:uiPriority="99" w:semiHidden="0" w:name="List Continue 3"/>
     <w:lsdException w:uiPriority="99" w:name="List Continue 4"/>
@@ -5921,7 +6472,7 @@
     <w:lsdException w:uiPriority="99" w:name="Body Text First Indent 2"/>
     <w:lsdException w:uiPriority="99" w:name="Note Heading"/>
     <w:lsdException w:qFormat="1" w:uiPriority="99" w:semiHidden="0" w:name="Body Text 2"/>
-    <w:lsdException w:uiPriority="99" w:semiHidden="0" w:name="Body Text 3"/>
+    <w:lsdException w:qFormat="1" w:uiPriority="99" w:semiHidden="0" w:name="Body Text 3"/>
     <w:lsdException w:uiPriority="99" w:name="Body Text Indent 2"/>
     <w:lsdException w:uiPriority="99" w:name="Body Text Indent 3"/>
     <w:lsdException w:uiPriority="99" w:name="Block Text"/>
@@ -5932,7 +6483,7 @@
     <w:lsdException w:uiPriority="99" w:name="Document Map"/>
     <w:lsdException w:uiPriority="99" w:name="Plain Text"/>
     <w:lsdException w:uiPriority="99" w:name="E-mail Signature"/>
-    <w:lsdException w:uiPriority="99" w:name="Normal (Web)"/>
+    <w:lsdException w:qFormat="1" w:uiPriority="99" w:name="Normal (Web)"/>
     <w:lsdException w:uiPriority="99" w:name="HTML Acronym"/>
     <w:lsdException w:uiPriority="99" w:name="HTML Address"/>
     <w:lsdException w:uiPriority="99" w:name="HTML Cite"/>
@@ -5995,7 +6546,7 @@
     <w:lsdException w:qFormat="1" w:unhideWhenUsed="0" w:uiPriority="61" w:semiHidden="0" w:name="Light List"/>
     <w:lsdException w:qFormat="1" w:unhideWhenUsed="0" w:uiPriority="62" w:semiHidden="0" w:name="Light Grid"/>
     <w:lsdException w:qFormat="1" w:unhideWhenUsed="0" w:uiPriority="63" w:semiHidden="0" w:name="Medium Shading 1"/>
-    <w:lsdException w:unhideWhenUsed="0" w:uiPriority="64" w:semiHidden="0" w:name="Medium Shading 2"/>
+    <w:lsdException w:qFormat="1" w:unhideWhenUsed="0" w:uiPriority="64" w:semiHidden="0" w:name="Medium Shading 2"/>
     <w:lsdException w:qFormat="1" w:unhideWhenUsed="0" w:uiPriority="65" w:semiHidden="0" w:name="Medium List 1"/>
     <w:lsdException w:qFormat="1" w:unhideWhenUsed="0" w:uiPriority="66" w:semiHidden="0" w:name="Medium List 2"/>
     <w:lsdException w:qFormat="1" w:unhideWhenUsed="0" w:uiPriority="67" w:semiHidden="0" w:name="Medium Grid 1"/>
@@ -6007,9 +6558,9 @@
     <w:lsdException w:qFormat="1" w:unhideWhenUsed="0" w:uiPriority="73" w:semiHidden="0" w:name="Colorful Grid"/>
     <w:lsdException w:qFormat="1" w:unhideWhenUsed="0" w:uiPriority="60" w:semiHidden="0" w:name="Light Shading Accent 1"/>
     <w:lsdException w:qFormat="1" w:unhideWhenUsed="0" w:uiPriority="61" w:semiHidden="0" w:name="Light List Accent 1"/>
-    <w:lsdException w:unhideWhenUsed="0" w:uiPriority="62" w:semiHidden="0" w:name="Light Grid Accent 1"/>
+    <w:lsdException w:qFormat="1" w:unhideWhenUsed="0" w:uiPriority="62" w:semiHidden="0" w:name="Light Grid Accent 1"/>
     <w:lsdException w:qFormat="1" w:unhideWhenUsed="0" w:uiPriority="63" w:semiHidden="0" w:name="Medium Shading 1 Accent 1"/>
-    <w:lsdException w:unhideWhenUsed="0" w:uiPriority="64" w:semiHidden="0" w:name="Medium Shading 2 Accent 1"/>
+    <w:lsdException w:qFormat="1" w:unhideWhenUsed="0" w:uiPriority="64" w:semiHidden="0" w:name="Medium Shading 2 Accent 1"/>
     <w:lsdException w:qFormat="1" w:unhideWhenUsed="0" w:uiPriority="65" w:semiHidden="0" w:name="Medium List 1 Accent 1"/>
     <w:lsdException w:qFormat="1" w:unhideWhenUsed="0" w:uiPriority="34" w:semiHidden="0" w:name="List Paragraph"/>
     <w:lsdException w:qFormat="1" w:unhideWhenUsed="0" w:uiPriority="29" w:semiHidden="0" w:name="Quote"/>
@@ -6017,16 +6568,16 @@
     <w:lsdException w:qFormat="1" w:unhideWhenUsed="0" w:uiPriority="66" w:semiHidden="0" w:name="Medium List 2 Accent 1"/>
     <w:lsdException w:qFormat="1" w:unhideWhenUsed="0" w:uiPriority="67" w:semiHidden="0" w:name="Medium Grid 1 Accent 1"/>
     <w:lsdException w:qFormat="1" w:unhideWhenUsed="0" w:uiPriority="68" w:semiHidden="0" w:name="Medium Grid 2 Accent 1"/>
-    <w:lsdException w:unhideWhenUsed="0" w:uiPriority="69" w:semiHidden="0" w:name="Medium Grid 3 Accent 1"/>
+    <w:lsdException w:qFormat="1" w:unhideWhenUsed="0" w:uiPriority="69" w:semiHidden="0" w:name="Medium Grid 3 Accent 1"/>
     <w:lsdException w:qFormat="1" w:unhideWhenUsed="0" w:uiPriority="70" w:semiHidden="0" w:name="Dark List Accent 1"/>
     <w:lsdException w:qFormat="1" w:unhideWhenUsed="0" w:uiPriority="71" w:semiHidden="0" w:name="Colorful Shading Accent 1"/>
     <w:lsdException w:unhideWhenUsed="0" w:uiPriority="72" w:semiHidden="0" w:name="Colorful List Accent 1"/>
     <w:lsdException w:unhideWhenUsed="0" w:uiPriority="73" w:semiHidden="0" w:name="Colorful Grid Accent 1"/>
-    <w:lsdException w:unhideWhenUsed="0" w:uiPriority="60" w:semiHidden="0" w:name="Light Shading Accent 2"/>
-    <w:lsdException w:unhideWhenUsed="0" w:uiPriority="61" w:semiHidden="0" w:name="Light List Accent 2"/>
+    <w:lsdException w:qFormat="1" w:unhideWhenUsed="0" w:uiPriority="60" w:semiHidden="0" w:name="Light Shading Accent 2"/>
+    <w:lsdException w:qFormat="1" w:unhideWhenUsed="0" w:uiPriority="61" w:semiHidden="0" w:name="Light List Accent 2"/>
     <w:lsdException w:qFormat="1" w:unhideWhenUsed="0" w:uiPriority="62" w:semiHidden="0" w:name="Light Grid Accent 2"/>
-    <w:lsdException w:unhideWhenUsed="0" w:uiPriority="63" w:semiHidden="0" w:name="Medium Shading 1 Accent 2"/>
-    <w:lsdException w:unhideWhenUsed="0" w:uiPriority="64" w:semiHidden="0" w:name="Medium Shading 2 Accent 2"/>
+    <w:lsdException w:qFormat="1" w:unhideWhenUsed="0" w:uiPriority="63" w:semiHidden="0" w:name="Medium Shading 1 Accent 2"/>
+    <w:lsdException w:qFormat="1" w:unhideWhenUsed="0" w:uiPriority="64" w:semiHidden="0" w:name="Medium Shading 2 Accent 2"/>
     <w:lsdException w:qFormat="1" w:unhideWhenUsed="0" w:uiPriority="65" w:semiHidden="0" w:name="Medium List 1 Accent 2"/>
     <w:lsdException w:qFormat="1" w:unhideWhenUsed="0" w:uiPriority="66" w:semiHidden="0" w:name="Medium List 2 Accent 2"/>
     <w:lsdException w:qFormat="1" w:unhideWhenUsed="0" w:uiPriority="67" w:semiHidden="0" w:name="Medium Grid 1 Accent 2"/>
@@ -6037,10 +6588,10 @@
     <w:lsdException w:qFormat="1" w:unhideWhenUsed="0" w:uiPriority="72" w:semiHidden="0" w:name="Colorful List Accent 2"/>
     <w:lsdException w:unhideWhenUsed="0" w:uiPriority="73" w:semiHidden="0" w:name="Colorful Grid Accent 2"/>
     <w:lsdException w:qFormat="1" w:unhideWhenUsed="0" w:uiPriority="60" w:semiHidden="0" w:name="Light Shading Accent 3"/>
-    <w:lsdException w:unhideWhenUsed="0" w:uiPriority="61" w:semiHidden="0" w:name="Light List Accent 3"/>
+    <w:lsdException w:qFormat="1" w:unhideWhenUsed="0" w:uiPriority="61" w:semiHidden="0" w:name="Light List Accent 3"/>
     <w:lsdException w:qFormat="1" w:unhideWhenUsed="0" w:uiPriority="62" w:semiHidden="0" w:name="Light Grid Accent 3"/>
     <w:lsdException w:qFormat="1" w:unhideWhenUsed="0" w:uiPriority="63" w:semiHidden="0" w:name="Medium Shading 1 Accent 3"/>
-    <w:lsdException w:unhideWhenUsed="0" w:uiPriority="64" w:semiHidden="0" w:name="Medium Shading 2 Accent 3"/>
+    <w:lsdException w:qFormat="1" w:unhideWhenUsed="0" w:uiPriority="64" w:semiHidden="0" w:name="Medium Shading 2 Accent 3"/>
     <w:lsdException w:qFormat="1" w:unhideWhenUsed="0" w:uiPriority="65" w:semiHidden="0" w:name="Medium List 1 Accent 3"/>
     <w:lsdException w:qFormat="1" w:unhideWhenUsed="0" w:uiPriority="66" w:semiHidden="0" w:name="Medium List 2 Accent 3"/>
     <w:lsdException w:qFormat="1" w:unhideWhenUsed="0" w:uiPriority="67" w:semiHidden="0" w:name="Medium Grid 1 Accent 3"/>
@@ -6050,12 +6601,12 @@
     <w:lsdException w:unhideWhenUsed="0" w:uiPriority="71" w:semiHidden="0" w:name="Colorful Shading Accent 3"/>
     <w:lsdException w:qFormat="1" w:unhideWhenUsed="0" w:uiPriority="72" w:semiHidden="0" w:name="Colorful List Accent 3"/>
     <w:lsdException w:unhideWhenUsed="0" w:uiPriority="73" w:semiHidden="0" w:name="Colorful Grid Accent 3"/>
-    <w:lsdException w:unhideWhenUsed="0" w:uiPriority="60" w:semiHidden="0" w:name="Light Shading Accent 4"/>
-    <w:lsdException w:unhideWhenUsed="0" w:uiPriority="61" w:semiHidden="0" w:name="Light List Accent 4"/>
-    <w:lsdException w:unhideWhenUsed="0" w:uiPriority="62" w:semiHidden="0" w:name="Light Grid Accent 4"/>
-    <w:lsdException w:unhideWhenUsed="0" w:uiPriority="63" w:semiHidden="0" w:name="Medium Shading 1 Accent 4"/>
-    <w:lsdException w:unhideWhenUsed="0" w:uiPriority="64" w:semiHidden="0" w:name="Medium Shading 2 Accent 4"/>
-    <w:lsdException w:unhideWhenUsed="0" w:uiPriority="65" w:semiHidden="0" w:name="Medium List 1 Accent 4"/>
+    <w:lsdException w:qFormat="1" w:unhideWhenUsed="0" w:uiPriority="60" w:semiHidden="0" w:name="Light Shading Accent 4"/>
+    <w:lsdException w:qFormat="1" w:unhideWhenUsed="0" w:uiPriority="61" w:semiHidden="0" w:name="Light List Accent 4"/>
+    <w:lsdException w:qFormat="1" w:unhideWhenUsed="0" w:uiPriority="62" w:semiHidden="0" w:name="Light Grid Accent 4"/>
+    <w:lsdException w:qFormat="1" w:unhideWhenUsed="0" w:uiPriority="63" w:semiHidden="0" w:name="Medium Shading 1 Accent 4"/>
+    <w:lsdException w:qFormat="1" w:unhideWhenUsed="0" w:uiPriority="64" w:semiHidden="0" w:name="Medium Shading 2 Accent 4"/>
+    <w:lsdException w:qFormat="1" w:unhideWhenUsed="0" w:uiPriority="65" w:semiHidden="0" w:name="Medium List 1 Accent 4"/>
     <w:lsdException w:qFormat="1" w:unhideWhenUsed="0" w:uiPriority="66" w:semiHidden="0" w:name="Medium List 2 Accent 4"/>
     <w:lsdException w:qFormat="1" w:unhideWhenUsed="0" w:uiPriority="67" w:semiHidden="0" w:name="Medium Grid 1 Accent 4"/>
     <w:lsdException w:qFormat="1" w:unhideWhenUsed="0" w:uiPriority="68" w:semiHidden="0" w:name="Medium Grid 2 Accent 4"/>
@@ -6064,11 +6615,11 @@
     <w:lsdException w:unhideWhenUsed="0" w:uiPriority="71" w:semiHidden="0" w:name="Colorful Shading Accent 4"/>
     <w:lsdException w:unhideWhenUsed="0" w:uiPriority="72" w:semiHidden="0" w:name="Colorful List Accent 4"/>
     <w:lsdException w:unhideWhenUsed="0" w:uiPriority="73" w:semiHidden="0" w:name="Colorful Grid Accent 4"/>
-    <w:lsdException w:unhideWhenUsed="0" w:uiPriority="60" w:semiHidden="0" w:name="Light Shading Accent 5"/>
-    <w:lsdException w:unhideWhenUsed="0" w:uiPriority="61" w:semiHidden="0" w:name="Light List Accent 5"/>
-    <w:lsdException w:unhideWhenUsed="0" w:uiPriority="62" w:semiHidden="0" w:name="Light Grid Accent 5"/>
-    <w:lsdException w:unhideWhenUsed="0" w:uiPriority="63" w:semiHidden="0" w:name="Medium Shading 1 Accent 5"/>
-    <w:lsdException w:unhideWhenUsed="0" w:uiPriority="64" w:semiHidden="0" w:name="Medium Shading 2 Accent 5"/>
+    <w:lsdException w:qFormat="1" w:unhideWhenUsed="0" w:uiPriority="60" w:semiHidden="0" w:name="Light Shading Accent 5"/>
+    <w:lsdException w:qFormat="1" w:unhideWhenUsed="0" w:uiPriority="61" w:semiHidden="0" w:name="Light List Accent 5"/>
+    <w:lsdException w:qFormat="1" w:unhideWhenUsed="0" w:uiPriority="62" w:semiHidden="0" w:name="Light Grid Accent 5"/>
+    <w:lsdException w:qFormat="1" w:unhideWhenUsed="0" w:uiPriority="63" w:semiHidden="0" w:name="Medium Shading 1 Accent 5"/>
+    <w:lsdException w:qFormat="1" w:unhideWhenUsed="0" w:uiPriority="64" w:semiHidden="0" w:name="Medium Shading 2 Accent 5"/>
     <w:lsdException w:qFormat="1" w:unhideWhenUsed="0" w:uiPriority="65" w:semiHidden="0" w:name="Medium List 1 Accent 5"/>
     <w:lsdException w:qFormat="1" w:unhideWhenUsed="0" w:uiPriority="66" w:semiHidden="0" w:name="Medium List 2 Accent 5"/>
     <w:lsdException w:qFormat="1" w:unhideWhenUsed="0" w:uiPriority="67" w:semiHidden="0" w:name="Medium Grid 1 Accent 5"/>
@@ -6078,7 +6629,7 @@
     <w:lsdException w:unhideWhenUsed="0" w:uiPriority="71" w:semiHidden="0" w:name="Colorful Shading Accent 5"/>
     <w:lsdException w:unhideWhenUsed="0" w:uiPriority="72" w:semiHidden="0" w:name="Colorful List Accent 5"/>
     <w:lsdException w:unhideWhenUsed="0" w:uiPriority="73" w:semiHidden="0" w:name="Colorful Grid Accent 5"/>
-    <w:lsdException w:unhideWhenUsed="0" w:uiPriority="60" w:semiHidden="0" w:name="Light Shading Accent 6"/>
+    <w:lsdException w:qFormat="1" w:unhideWhenUsed="0" w:uiPriority="60" w:semiHidden="0" w:name="Light Shading Accent 6"/>
     <w:lsdException w:qFormat="1" w:unhideWhenUsed="0" w:uiPriority="61" w:semiHidden="0" w:name="Light List Accent 6"/>
     <w:lsdException w:qFormat="1" w:unhideWhenUsed="0" w:uiPriority="62" w:semiHidden="0" w:name="Light Grid Accent 6"/>
     <w:lsdException w:qFormat="1" w:unhideWhenUsed="0" w:uiPriority="63" w:semiHidden="0" w:name="Medium Shading 1 Accent 6"/>
@@ -6086,7 +6637,7 @@
     <w:lsdException w:qFormat="1" w:unhideWhenUsed="0" w:uiPriority="65" w:semiHidden="0" w:name="Medium List 1 Accent 6"/>
     <w:lsdException w:qFormat="1" w:unhideWhenUsed="0" w:uiPriority="66" w:semiHidden="0" w:name="Medium List 2 Accent 6"/>
     <w:lsdException w:qFormat="1" w:unhideWhenUsed="0" w:uiPriority="67" w:semiHidden="0" w:name="Medium Grid 1 Accent 6"/>
-    <w:lsdException w:unhideWhenUsed="0" w:uiPriority="68" w:semiHidden="0" w:name="Medium Grid 2 Accent 6"/>
+    <w:lsdException w:qFormat="1" w:unhideWhenUsed="0" w:uiPriority="68" w:semiHidden="0" w:name="Medium Grid 2 Accent 6"/>
     <w:lsdException w:qFormat="1" w:unhideWhenUsed="0" w:uiPriority="69" w:semiHidden="0" w:name="Medium Grid 3 Accent 6"/>
     <w:lsdException w:qFormat="1" w:unhideWhenUsed="0" w:uiPriority="70" w:semiHidden="0" w:name="Dark List Accent 6"/>
     <w:lsdException w:unhideWhenUsed="0" w:uiPriority="71" w:semiHidden="0" w:name="Colorful Shading Accent 6"/>
@@ -6347,6 +6898,7 @@
     <w:name w:val="Default Paragraph Font"/>
     <w:semiHidden/>
     <w:unhideWhenUsed/>
+    <w:qFormat/>
     <w:uiPriority w:val="1"/>
   </w:style>
   <w:style w:type="table" w:default="1" w:styleId="33">
@@ -6368,6 +6920,7 @@
     <w:name w:val="macro"/>
     <w:link w:val="148"/>
     <w:unhideWhenUsed/>
+    <w:qFormat/>
     <w:uiPriority w:val="99"/>
     <w:pPr>
       <w:tabs>
@@ -6470,6 +7023,7 @@
     <w:basedOn w:val="1"/>
     <w:link w:val="147"/>
     <w:unhideWhenUsed/>
+    <w:qFormat/>
     <w:uiPriority w:val="99"/>
     <w:pPr>
       <w:spacing w:after="120"/>
@@ -6522,6 +7076,7 @@
     <w:name w:val="List 2"/>
     <w:basedOn w:val="1"/>
     <w:unhideWhenUsed/>
+    <w:qFormat/>
     <w:uiPriority w:val="99"/>
     <w:pPr>
       <w:ind w:left="720" w:hanging="360"/>
@@ -6532,6 +7087,7 @@
     <w:name w:val="List Continue"/>
     <w:basedOn w:val="1"/>
     <w:unhideWhenUsed/>
+    <w:qFormat/>
     <w:uiPriority w:val="99"/>
     <w:pPr>
       <w:spacing w:after="120"/>
@@ -6558,6 +7114,7 @@
     <w:basedOn w:val="1"/>
     <w:link w:val="137"/>
     <w:unhideWhenUsed/>
+    <w:qFormat/>
     <w:uiPriority w:val="99"/>
     <w:pPr>
       <w:tabs>
@@ -6572,6 +7129,7 @@
     <w:basedOn w:val="1"/>
     <w:link w:val="136"/>
     <w:unhideWhenUsed/>
+    <w:qFormat/>
     <w:uiPriority w:val="99"/>
     <w:pPr>
       <w:tabs>
@@ -6642,6 +7200,7 @@
     <w:basedOn w:val="1"/>
     <w:semiHidden/>
     <w:unhideWhenUsed/>
+    <w:qFormat/>
     <w:uiPriority w:val="99"/>
     <w:pPr>
       <w:spacing w:before="0" w:beforeAutospacing="1" w:after="0" w:afterAutospacing="1"/>
@@ -6917,6 +7476,7 @@
   <w:style w:type="table" w:styleId="37">
     <w:name w:val="Light Shading Accent 2"/>
     <w:basedOn w:val="33"/>
+    <w:qFormat/>
     <w:uiPriority w:val="60"/>
     <w:pPr>
       <w:spacing w:after="0" w:line="240" w:lineRule="auto"/>
@@ -7116,6 +7676,7 @@
   <w:style w:type="table" w:styleId="39">
     <w:name w:val="Light Shading Accent 4"/>
     <w:basedOn w:val="33"/>
+    <w:qFormat/>
     <w:uiPriority w:val="60"/>
     <w:pPr>
       <w:spacing w:after="0" w:line="240" w:lineRule="auto"/>
@@ -7215,6 +7776,7 @@
   <w:style w:type="table" w:styleId="40">
     <w:name w:val="Light Shading Accent 5"/>
     <w:basedOn w:val="33"/>
+    <w:qFormat/>
     <w:uiPriority w:val="60"/>
     <w:pPr>
       <w:spacing w:after="0" w:line="240" w:lineRule="auto"/>
@@ -7314,6 +7876,7 @@
   <w:style w:type="table" w:styleId="41">
     <w:name w:val="Light Shading Accent 6"/>
     <w:basedOn w:val="33"/>
+    <w:qFormat/>
     <w:uiPriority w:val="60"/>
     <w:pPr>
       <w:spacing w:after="0" w:line="240" w:lineRule="auto"/>
@@ -7601,6 +8164,7 @@
   <w:style w:type="table" w:styleId="44">
     <w:name w:val="Light List Accent 2"/>
     <w:basedOn w:val="33"/>
+    <w:qFormat/>
     <w:uiPriority w:val="61"/>
     <w:pPr>
       <w:spacing w:after="0" w:line="240" w:lineRule="auto"/>
@@ -7694,6 +8258,7 @@
   <w:style w:type="table" w:styleId="45">
     <w:name w:val="Light List Accent 3"/>
     <w:basedOn w:val="33"/>
+    <w:qFormat/>
     <w:uiPriority w:val="61"/>
     <w:pPr>
       <w:spacing w:after="0" w:line="240" w:lineRule="auto"/>
@@ -7787,6 +8352,7 @@
   <w:style w:type="table" w:styleId="46">
     <w:name w:val="Light List Accent 4"/>
     <w:basedOn w:val="33"/>
+    <w:qFormat/>
     <w:uiPriority w:val="61"/>
     <w:pPr>
       <w:spacing w:after="0" w:line="240" w:lineRule="auto"/>
@@ -7880,6 +8446,7 @@
   <w:style w:type="table" w:styleId="47">
     <w:name w:val="Light List Accent 5"/>
     <w:basedOn w:val="33"/>
+    <w:qFormat/>
     <w:uiPriority w:val="61"/>
     <w:pPr>
       <w:spacing w:after="0" w:line="240" w:lineRule="auto"/>
@@ -8194,6 +8761,7 @@
   <w:style w:type="table" w:styleId="50">
     <w:name w:val="Light Grid Accent 1"/>
     <w:basedOn w:val="33"/>
+    <w:qFormat/>
     <w:uiPriority w:val="62"/>
     <w:pPr>
       <w:spacing w:after="0" w:line="240" w:lineRule="auto"/>
@@ -8574,6 +9142,7 @@
   <w:style w:type="table" w:styleId="53">
     <w:name w:val="Light Grid Accent 4"/>
     <w:basedOn w:val="33"/>
+    <w:qFormat/>
     <w:uiPriority w:val="62"/>
     <w:pPr>
       <w:spacing w:after="0" w:line="240" w:lineRule="auto"/>
@@ -8700,6 +9269,7 @@
   <w:style w:type="table" w:styleId="54">
     <w:name w:val="Light Grid Accent 5"/>
     <w:basedOn w:val="33"/>
+    <w:qFormat/>
     <w:uiPriority w:val="62"/>
     <w:pPr>
       <w:spacing w:after="0" w:line="240" w:lineRule="auto"/>
@@ -9169,6 +9739,7 @@
   <w:style w:type="table" w:styleId="58">
     <w:name w:val="Medium Shading 1 Accent 2"/>
     <w:basedOn w:val="33"/>
+    <w:qFormat/>
     <w:uiPriority w:val="63"/>
     <w:pPr>
       <w:spacing w:after="0" w:line="240" w:lineRule="auto"/>
@@ -9384,6 +9955,7 @@
   <w:style w:type="table" w:styleId="60">
     <w:name w:val="Medium Shading 1 Accent 4"/>
     <w:basedOn w:val="33"/>
+    <w:qFormat/>
     <w:uiPriority w:val="63"/>
     <w:pPr>
       <w:spacing w:after="0" w:line="240" w:lineRule="auto"/>
@@ -9491,6 +10063,7 @@
   <w:style w:type="table" w:styleId="61">
     <w:name w:val="Medium Shading 1 Accent 5"/>
     <w:basedOn w:val="33"/>
+    <w:qFormat/>
     <w:uiPriority w:val="63"/>
     <w:pPr>
       <w:spacing w:after="0" w:line="240" w:lineRule="auto"/>
@@ -9706,6 +10279,7 @@
   <w:style w:type="table" w:styleId="63">
     <w:name w:val="Medium Shading 2"/>
     <w:basedOn w:val="33"/>
+    <w:qFormat/>
     <w:uiPriority w:val="64"/>
     <w:pPr>
       <w:spacing w:after="0" w:line="240" w:lineRule="auto"/>
@@ -9871,6 +10445,7 @@
   <w:style w:type="table" w:styleId="64">
     <w:name w:val="Medium Shading 2 Accent 1"/>
     <w:basedOn w:val="33"/>
+    <w:qFormat/>
     <w:uiPriority w:val="64"/>
     <w:pPr>
       <w:spacing w:after="0" w:line="240" w:lineRule="auto"/>
@@ -10036,6 +10611,7 @@
   <w:style w:type="table" w:styleId="65">
     <w:name w:val="Medium Shading 2 Accent 2"/>
     <w:basedOn w:val="33"/>
+    <w:qFormat/>
     <w:uiPriority w:val="64"/>
     <w:pPr>
       <w:spacing w:after="0" w:line="240" w:lineRule="auto"/>
@@ -10201,6 +10777,7 @@
   <w:style w:type="table" w:styleId="66">
     <w:name w:val="Medium Shading 2 Accent 3"/>
     <w:basedOn w:val="33"/>
+    <w:qFormat/>
     <w:uiPriority w:val="64"/>
     <w:pPr>
       <w:spacing w:after="0" w:line="240" w:lineRule="auto"/>
@@ -10366,6 +10943,7 @@
   <w:style w:type="table" w:styleId="67">
     <w:name w:val="Medium Shading 2 Accent 4"/>
     <w:basedOn w:val="33"/>
+    <w:qFormat/>
     <w:uiPriority w:val="64"/>
     <w:pPr>
       <w:spacing w:after="0" w:line="240" w:lineRule="auto"/>
@@ -10531,6 +11109,7 @@
   <w:style w:type="table" w:styleId="68">
     <w:name w:val="Medium Shading 2 Accent 5"/>
     <w:basedOn w:val="33"/>
+    <w:qFormat/>
     <w:uiPriority w:val="64"/>
     <w:pPr>
       <w:spacing w:after="0" w:line="240" w:lineRule="auto"/>
@@ -11226,6 +11805,7 @@
   <w:style w:type="table" w:styleId="74">
     <w:name w:val="Medium List 1 Accent 4"/>
     <w:basedOn w:val="33"/>
+    <w:qFormat/>
     <w:uiPriority w:val="65"/>
     <w:pPr>
       <w:spacing w:after="0" w:line="240" w:lineRule="auto"/>
@@ -13780,6 +14360,7 @@
   <w:style w:type="table" w:styleId="97">
     <w:name w:val="Medium Grid 2 Accent 6"/>
     <w:basedOn w:val="33"/>
+    <w:qFormat/>
     <w:uiPriority w:val="68"/>
     <w:pPr>
       <w:spacing w:after="0" w:line="240" w:lineRule="auto"/>
@@ -14084,6 +14665,7 @@
   <w:style w:type="table" w:styleId="99">
     <w:name w:val="Medium Grid 3 Accent 1"/>
     <w:basedOn w:val="33"/>
+    <w:qFormat/>
     <w:uiPriority w:val="69"/>
     <w:pPr>
       <w:spacing w:after="0" w:line="240" w:lineRule="auto"/>

</xml_diff>